<commit_message>
se añade para actas, se acorta texto y se añade para trasncripciones
</commit_message>
<xml_diff>
--- a/public/plantilla-integra.docx
+++ b/public/plantilla-integra.docx
@@ -184,7 +184,14 @@
         <w:rPr>
           <w:color w:val="6B7280"/>
         </w:rPr>
-        <w:t xml:space="preserve">  —  vía {{VIA}}</w:t>
+        <w:t xml:space="preserve">  —</w:t>
+      </w:r>
+      <w:proofErr w:type="gramEnd"/>
+      <w:r>
+        <w:rPr>
+          <w:color w:val="6B7280"/>
+        </w:rPr>
+        <w:t xml:space="preserve">  vía {{VIA}}</w:t>
       </w:r>
     </w:p>
     <w:p>
@@ -204,6 +211,7 @@
     </w:p>
     <w:p>
       <w:pPr>
+        <w:pageBreakBefore/>
         <w:spacing w:after="80"/>
         <w:jc w:val="center"/>
       </w:pPr>
@@ -572,11 +580,7 @@
         </w:drawing>
       </w:r>
     </w:p>
-    <w:p>
-      <w:r>
-        <w:br w:type="page"/>
-      </w:r>
-    </w:p>
+    <w:p/>
     <w:p>
       <w:pPr>
         <w:spacing w:after="80"/>
@@ -590,7 +594,6 @@
           <w:sz w:val="40"/>
           <w:szCs w:val="40"/>
         </w:rPr>
-        <w:lastRenderedPageBreak/>
         <w:t>ACCIONES CONJUNTAS</w:t>
       </w:r>
     </w:p>
@@ -640,7 +643,21 @@
         <w:rPr>
           <w:color w:val="1A1A1A"/>
         </w:rPr>
-        <w:t>Ofrecemos un servicio ilimitado para favorecer la integración de personas en exclusión social (mujeres víctimas de violencia, personas sin hogar, ex reclusos, ex drogodependientes…) y personas con discapacidad en los equipos de trabajo.</w:t>
+        <w:t xml:space="preserve">Ofrecemos un servicio ilimitado para favorecer la integración de personas en exclusión social (mujeres víctimas de violencia, personas sin hogar, </w:t>
+      </w:r>
+      <w:proofErr w:type="gramStart"/>
+      <w:r>
+        <w:rPr>
+          <w:color w:val="1A1A1A"/>
+        </w:rPr>
+        <w:t>ex reclusos</w:t>
+      </w:r>
+      <w:proofErr w:type="gramEnd"/>
+      <w:r>
+        <w:rPr>
+          <w:color w:val="1A1A1A"/>
+        </w:rPr>
+        <w:t>, ex drogodependientes…) y personas con discapacidad en los equipos de trabajo.</w:t>
       </w:r>
     </w:p>
     <w:p>
@@ -833,7 +850,21 @@
         <w:rPr>
           <w:color w:val="1A1A1A"/>
         </w:rPr>
-        <w:t xml:space="preserve"> programa integral de formación prelaboral que mejora la empleabilidad de los candidatos.</w:t>
+        <w:t xml:space="preserve"> programa integral de formación </w:t>
+      </w:r>
+      <w:proofErr w:type="spellStart"/>
+      <w:r>
+        <w:rPr>
+          <w:color w:val="1A1A1A"/>
+        </w:rPr>
+        <w:t>prelaboral</w:t>
+      </w:r>
+      <w:proofErr w:type="spellEnd"/>
+      <w:r>
+        <w:rPr>
+          <w:color w:val="1A1A1A"/>
+        </w:rPr>
+        <w:t xml:space="preserve"> que mejora la empleabilidad de los candidatos.</w:t>
       </w:r>
     </w:p>
     <w:p>
@@ -1027,7 +1058,21 @@
         <w:rPr>
           <w:color w:val="1A1A1A"/>
         </w:rPr>
-        <w:t xml:space="preserve"> en materiales divulgativos, newsletter y memoria anual.</w:t>
+        <w:t xml:space="preserve"> en materiales divulgativos, </w:t>
+      </w:r>
+      <w:proofErr w:type="spellStart"/>
+      <w:r>
+        <w:rPr>
+          <w:color w:val="1A1A1A"/>
+        </w:rPr>
+        <w:t>newsletter</w:t>
+      </w:r>
+      <w:proofErr w:type="spellEnd"/>
+      <w:r>
+        <w:rPr>
+          <w:color w:val="1A1A1A"/>
+        </w:rPr>
+        <w:t xml:space="preserve"> y memoria anual.</w:t>
       </w:r>
     </w:p>
     <w:p>
@@ -1041,6 +1086,7 @@
           <w:bCs/>
           <w:color w:val="C73E3A"/>
         </w:rPr>
+        <w:lastRenderedPageBreak/>
         <w:t xml:space="preserve">• </w:t>
       </w:r>
       <w:r>
@@ -1058,11 +1104,7 @@
         <w:t xml:space="preserve"> para dar respuesta a la normativa CSRD, índices y ratings ESG.</w:t>
       </w:r>
     </w:p>
-    <w:p>
-      <w:r>
-        <w:br w:type="page"/>
-      </w:r>
-    </w:p>
+    <w:p/>
     <w:p>
       <w:pPr>
         <w:spacing w:after="360"/>
@@ -1076,7 +1118,6 @@
           <w:sz w:val="36"/>
           <w:szCs w:val="36"/>
         </w:rPr>
-        <w:lastRenderedPageBreak/>
         <w:t>BENEFICIOS PARA LA COMPAÑÍA</w:t>
       </w:r>
     </w:p>
@@ -1409,7 +1450,14 @@
         <w:rPr>
           <w:color w:val="6B7280"/>
         </w:rPr>
-        <w:t xml:space="preserve">    ·    vía {{VIA_CUERPO}}</w:t>
+        <w:t xml:space="preserve">   </w:t>
+      </w:r>
+      <w:proofErr w:type="gramEnd"/>
+      <w:r>
+        <w:rPr>
+          <w:color w:val="6B7280"/>
+        </w:rPr>
+        <w:t xml:space="preserve"> ·    vía {{VIA_CUERPO}}</w:t>
       </w:r>
     </w:p>
     <w:p>
@@ -1462,7 +1510,29 @@
           <w:sz w:val="16"/>
           <w:szCs w:val="16"/>
         </w:rPr>
-        <w:t>(*) Aplicable deducción del Impuesto de Sociedades (40%). Bonificaciones por contratación de personas con discapacidad, mujeres víctimas de violencia y personas en exclusión social. Ahorro en la LGD a través de la contratación directa de PcD.</w:t>
+        <w:t xml:space="preserve">(*) Aplicable deducción del Impuesto de Sociedades (40%). Bonificaciones por contratación de personas con discapacidad, mujeres víctimas de violencia y personas en exclusión social. Ahorro en la LGD a través de la contratación directa de </w:t>
+      </w:r>
+      <w:proofErr w:type="spellStart"/>
+      <w:r>
+        <w:rPr>
+          <w:i/>
+          <w:iCs/>
+          <w:color w:val="6B7280"/>
+          <w:sz w:val="16"/>
+          <w:szCs w:val="16"/>
+        </w:rPr>
+        <w:t>PcD</w:t>
+      </w:r>
+      <w:proofErr w:type="spellEnd"/>
+      <w:r>
+        <w:rPr>
+          <w:i/>
+          <w:iCs/>
+          <w:color w:val="6B7280"/>
+          <w:sz w:val="16"/>
+          <w:szCs w:val="16"/>
+        </w:rPr>
+        <w:t>.</w:t>
       </w:r>
     </w:p>
     <w:p>
@@ -1587,12 +1657,6 @@
       <w:gridCol w:w="4680"/>
     </w:tblGrid>
     <w:tr>
-      <w:tblPrEx>
-        <w:tblCellMar>
-          <w:top w:w="0" w:type="dxa"/>
-          <w:bottom w:w="0" w:type="dxa"/>
-        </w:tblCellMar>
-      </w:tblPrEx>
       <w:tc>
         <w:tcPr>
           <w:tcW w:w="4680" w:type="dxa"/>

</xml_diff>